<commit_message>
updating scripts, data & figures
</commit_message>
<xml_diff>
--- a/figures/table1_summary.docx
+++ b/figures/table1_summary.docx
@@ -182,7 +182,7 @@
                 <w:rFonts w:ascii="Calibri" w:hAnsi="Calibri"/>
                 <w:sz w:val="20"/>
               </w:rPr>
-              <w:t xml:space="default">4.25</w:t>
+              <w:t xml:space="default">5.50</w:t>
             </w:r>
           </w:p>
         </w:tc>
@@ -206,7 +206,7 @@
                 <w:rFonts w:ascii="Calibri" w:hAnsi="Calibri"/>
                 <w:sz w:val="20"/>
               </w:rPr>
-              <w:t xml:space="default">0.53</w:t>
+              <w:t xml:space="default">0.91</w:t>
             </w:r>
           </w:p>
         </w:tc>
@@ -235,7 +235,7 @@
                 <w:rFonts w:ascii="Calibri" w:hAnsi="Calibri"/>
                 <w:sz w:val="20"/>
               </w:rPr>
-              <w:t xml:space="default">Velocity of isotherm shift</w:t>
+              <w:t xml:space="default">Potential dispersal rate and velocity of isotherm shift (interactive)</w:t>
             </w:r>
           </w:p>
         </w:tc>
@@ -259,7 +259,7 @@
                 <w:rFonts w:ascii="Calibri" w:hAnsi="Calibri"/>
                 <w:sz w:val="20"/>
               </w:rPr>
-              <w:t xml:space="default">2</w:t>
+              <w:t xml:space="default">3</w:t>
             </w:r>
           </w:p>
         </w:tc>
@@ -283,7 +283,7 @@
                 <w:rFonts w:ascii="Calibri" w:hAnsi="Calibri"/>
                 <w:sz w:val="20"/>
               </w:rPr>
-              <w:t xml:space="default">3.50</w:t>
+              <w:t xml:space="default">7.25</w:t>
             </w:r>
           </w:p>
         </w:tc>
@@ -307,7 +307,7 @@
                 <w:rFonts w:ascii="Calibri" w:hAnsi="Calibri"/>
                 <w:sz w:val="20"/>
               </w:rPr>
-              <w:t xml:space="default">0.22</w:t>
+              <w:t xml:space="default">0.04</w:t>
             </w:r>
           </w:p>
         </w:tc>
@@ -336,7 +336,7 @@
                 <w:rFonts w:ascii="Calibri" w:hAnsi="Calibri"/>
                 <w:sz w:val="20"/>
               </w:rPr>
-              <w:t xml:space="default">Potential dispersal rate and velocity of isotherm shift (additive)</w:t>
+              <w:t xml:space="default">Velocity of isotherm shift</w:t>
             </w:r>
           </w:p>
         </w:tc>
@@ -360,7 +360,7 @@
                 <w:rFonts w:ascii="Calibri" w:hAnsi="Calibri"/>
                 <w:sz w:val="20"/>
               </w:rPr>
-              <w:t xml:space="default">6</w:t>
+              <w:t xml:space="default">4</w:t>
             </w:r>
           </w:p>
         </w:tc>
@@ -384,7 +384,7 @@
                 <w:rFonts w:ascii="Calibri" w:hAnsi="Calibri"/>
                 <w:sz w:val="20"/>
               </w:rPr>
-              <w:t xml:space="default">8.75</w:t>
+              <w:t xml:space="default">8.00</w:t>
             </w:r>
           </w:p>
         </w:tc>
@@ -408,7 +408,7 @@
                 <w:rFonts w:ascii="Calibri" w:hAnsi="Calibri"/>
                 <w:sz w:val="20"/>
               </w:rPr>
-              <w:t xml:space="default">0.16</w:t>
+              <w:t xml:space="default">0.02</w:t>
             </w:r>
           </w:p>
         </w:tc>
@@ -437,7 +437,7 @@
                 <w:rFonts w:ascii="Calibri" w:hAnsi="Calibri"/>
                 <w:sz w:val="20"/>
               </w:rPr>
-              <w:t xml:space="default">Potential dispersal rate and velocity of isotherm shift (interactive)</w:t>
+              <w:t xml:space="default">Potential dispersal rate and velocity of isotherm shift (additive)</w:t>
             </w:r>
           </w:p>
         </w:tc>
@@ -461,7 +461,7 @@
                 <w:rFonts w:ascii="Calibri" w:hAnsi="Calibri"/>
                 <w:sz w:val="20"/>
               </w:rPr>
-              <w:t xml:space="default">8</w:t>
+              <w:t xml:space="default">5</w:t>
             </w:r>
           </w:p>
         </w:tc>
@@ -485,7 +485,7 @@
                 <w:rFonts w:ascii="Calibri" w:hAnsi="Calibri"/>
                 <w:sz w:val="20"/>
               </w:rPr>
-              <w:t xml:space="default">11.50</w:t>
+              <w:t xml:space="default">9.50</w:t>
             </w:r>
           </w:p>
         </w:tc>
@@ -509,7 +509,7 @@
                 <w:rFonts w:ascii="Calibri" w:hAnsi="Calibri"/>
                 <w:sz w:val="20"/>
               </w:rPr>
-              <w:t xml:space="default">0.10</w:t>
+              <w:t xml:space="default">0.02</w:t>
             </w:r>
           </w:p>
         </w:tc>

</xml_diff>